<commit_message>
thêm nội dung mới
</commit_message>
<xml_diff>
--- a/JS.docx
+++ b/JS.docx
@@ -7916,30 +7916,322 @@
         </w:rPr>
         <w:t>Lấy giá trị style đã set: VD: element.style.backgroundColor //“red”</w:t>
       </w:r>
+    </w:p>
+    <w:p>
+      <w:pPr>
+        <w:pStyle w:val="ListParagraph"/>
+        <w:ind w:left="1080"/>
+        <w:rPr>
+          <w:rFonts w:ascii="Times New Roman" w:eastAsiaTheme="majorEastAsia" w:hAnsi="Times New Roman" w:cs="Times New Roman"/>
+          <w:sz w:val="32"/>
+          <w:szCs w:val="32"/>
+          <w:lang w:val="vi-VN"/>
+        </w:rPr>
+      </w:pPr>
+      <w:r>
+        <w:rPr>
+          <w:rFonts w:ascii="Times New Roman" w:eastAsiaTheme="majorEastAsia" w:hAnsi="Times New Roman" w:cs="Times New Roman"/>
+          <w:sz w:val="32"/>
+          <w:szCs w:val="32"/>
+          <w:lang w:val="vi-VN"/>
+        </w:rPr>
+        <w:lastRenderedPageBreak/>
+        <w:t>Phân biệt inline style và external CSS: style chỉ thao tác với inline style, nếu muốn thay đổi toàn bộ nên dùng class và CSS external</w:t>
+      </w:r>
+    </w:p>
+    <w:p>
+      <w:pPr>
+        <w:pStyle w:val="ListParagraph"/>
+        <w:numPr>
+          <w:ilvl w:val="0"/>
+          <w:numId w:val="2"/>
+        </w:numPr>
+        <w:rPr>
+          <w:rFonts w:ascii="Times New Roman" w:eastAsiaTheme="majorEastAsia" w:hAnsi="Times New Roman" w:cs="Times New Roman"/>
+          <w:sz w:val="32"/>
+          <w:szCs w:val="32"/>
+          <w:lang w:val="vi-VN"/>
+        </w:rPr>
+      </w:pPr>
+      <w:r>
+        <w:rPr>
+          <w:rFonts w:ascii="Times New Roman" w:eastAsiaTheme="majorEastAsia" w:hAnsi="Times New Roman" w:cs="Times New Roman"/>
+          <w:sz w:val="32"/>
+          <w:szCs w:val="32"/>
+          <w:lang w:val="vi-VN"/>
+        </w:rPr>
+        <w:t>Classlist</w:t>
+      </w:r>
+    </w:p>
+    <w:p>
+      <w:pPr>
+        <w:pStyle w:val="ListParagraph"/>
+        <w:ind w:left="1080"/>
+        <w:rPr>
+          <w:rFonts w:ascii="Times New Roman" w:eastAsiaTheme="majorEastAsia" w:hAnsi="Times New Roman" w:cs="Times New Roman"/>
+          <w:sz w:val="32"/>
+          <w:szCs w:val="32"/>
+          <w:lang w:val="vi-VN"/>
+        </w:rPr>
+      </w:pPr>
+      <w:r>
+        <w:rPr>
+          <w:rFonts w:ascii="Times New Roman" w:eastAsiaTheme="majorEastAsia" w:hAnsi="Times New Roman" w:cs="Times New Roman"/>
+          <w:sz w:val="32"/>
+          <w:szCs w:val="32"/>
+          <w:lang w:val="vi-VN"/>
+        </w:rPr>
+        <w:t>Là 1 thuộc tính của phần tử DOM trong JS, cho phép thao tác trực tiếp với danh sách các class CSS gắn trên phần tử</w:t>
+      </w:r>
+    </w:p>
+    <w:p>
+      <w:pPr>
+        <w:pStyle w:val="ListParagraph"/>
+        <w:ind w:left="1080"/>
+        <w:rPr>
+          <w:rFonts w:ascii="Times New Roman" w:eastAsiaTheme="majorEastAsia" w:hAnsi="Times New Roman" w:cs="Times New Roman"/>
+          <w:color w:val="FF0000"/>
+          <w:sz w:val="32"/>
+          <w:szCs w:val="32"/>
+          <w:lang w:val="vi-VN"/>
+        </w:rPr>
+      </w:pPr>
+      <w:r>
+        <w:rPr>
+          <w:rFonts w:ascii="Times New Roman" w:eastAsiaTheme="majorEastAsia" w:hAnsi="Times New Roman" w:cs="Times New Roman"/>
+          <w:color w:val="FF0000"/>
+          <w:sz w:val="32"/>
+          <w:szCs w:val="32"/>
+          <w:lang w:val="vi-VN"/>
+        </w:rPr>
+        <w:t>Các phương thức</w:t>
+      </w:r>
+    </w:p>
+    <w:p>
+      <w:pPr>
+        <w:pStyle w:val="ListParagraph"/>
+        <w:ind w:left="1080"/>
+        <w:rPr>
+          <w:rFonts w:ascii="Times New Roman" w:eastAsiaTheme="majorEastAsia" w:hAnsi="Times New Roman" w:cs="Times New Roman"/>
+          <w:sz w:val="32"/>
+          <w:szCs w:val="32"/>
+          <w:lang w:val="vi-VN"/>
+        </w:rPr>
+      </w:pPr>
+      <w:r>
+        <w:rPr>
+          <w:rFonts w:ascii="Times New Roman" w:eastAsiaTheme="majorEastAsia" w:hAnsi="Times New Roman" w:cs="Times New Roman"/>
+          <w:sz w:val="32"/>
+          <w:szCs w:val="32"/>
+          <w:lang w:val="vi-VN"/>
+        </w:rPr>
+        <w:t>add(className): thêm 1 hoặc nhiều class mới vào phần tử</w:t>
+      </w:r>
+    </w:p>
+    <w:p>
+      <w:pPr>
+        <w:pStyle w:val="ListParagraph"/>
+        <w:ind w:left="1080"/>
+        <w:rPr>
+          <w:rFonts w:ascii="Times New Roman" w:eastAsiaTheme="majorEastAsia" w:hAnsi="Times New Roman" w:cs="Times New Roman"/>
+          <w:sz w:val="32"/>
+          <w:szCs w:val="32"/>
+          <w:lang w:val="vi-VN"/>
+        </w:rPr>
+      </w:pPr>
+      <w:r>
+        <w:rPr>
+          <w:rFonts w:ascii="Times New Roman" w:eastAsiaTheme="majorEastAsia" w:hAnsi="Times New Roman" w:cs="Times New Roman"/>
+          <w:sz w:val="32"/>
+          <w:szCs w:val="32"/>
+          <w:lang w:val="vi-VN"/>
+        </w:rPr>
+        <w:t>remove(className): xóa 1 hoặc nhiều class khỏi phần tử</w:t>
+      </w:r>
+    </w:p>
+    <w:p>
+      <w:pPr>
+        <w:pStyle w:val="ListParagraph"/>
+        <w:ind w:left="1080"/>
+        <w:rPr>
+          <w:rFonts w:ascii="Times New Roman" w:eastAsiaTheme="majorEastAsia" w:hAnsi="Times New Roman" w:cs="Times New Roman"/>
+          <w:sz w:val="32"/>
+          <w:szCs w:val="32"/>
+          <w:lang w:val="vi-VN"/>
+        </w:rPr>
+      </w:pPr>
+      <w:r>
+        <w:rPr>
+          <w:rFonts w:ascii="Times New Roman" w:eastAsiaTheme="majorEastAsia" w:hAnsi="Times New Roman" w:cs="Times New Roman"/>
+          <w:sz w:val="32"/>
+          <w:szCs w:val="32"/>
+          <w:lang w:val="vi-VN"/>
+        </w:rPr>
+        <w:t>toggle(className): nếu class chưa có thì thêm, nếu đã có thì xóa</w:t>
+      </w:r>
+    </w:p>
+    <w:p>
+      <w:pPr>
+        <w:pStyle w:val="ListParagraph"/>
+        <w:ind w:left="1080"/>
+        <w:rPr>
+          <w:rFonts w:ascii="Times New Roman" w:eastAsiaTheme="majorEastAsia" w:hAnsi="Times New Roman" w:cs="Times New Roman"/>
+          <w:sz w:val="32"/>
+          <w:szCs w:val="32"/>
+          <w:lang w:val="vi-VN"/>
+        </w:rPr>
+      </w:pPr>
+      <w:r>
+        <w:rPr>
+          <w:rFonts w:ascii="Times New Roman" w:eastAsiaTheme="majorEastAsia" w:hAnsi="Times New Roman" w:cs="Times New Roman"/>
+          <w:sz w:val="32"/>
+          <w:szCs w:val="32"/>
+          <w:lang w:val="vi-VN"/>
+        </w:rPr>
+        <w:t>contains(className): kiểm tra xem phần tử có class cụ thể hay không</w:t>
+      </w:r>
+    </w:p>
+    <w:p>
+      <w:pPr>
+        <w:pStyle w:val="ListParagraph"/>
+        <w:ind w:left="1080"/>
+        <w:rPr>
+          <w:rFonts w:ascii="Times New Roman" w:eastAsiaTheme="majorEastAsia" w:hAnsi="Times New Roman" w:cs="Times New Roman"/>
+          <w:sz w:val="32"/>
+          <w:szCs w:val="32"/>
+          <w:lang w:val="vi-VN"/>
+        </w:rPr>
+      </w:pPr>
+      <w:r>
+        <w:rPr>
+          <w:rFonts w:ascii="Times New Roman" w:eastAsiaTheme="majorEastAsia" w:hAnsi="Times New Roman" w:cs="Times New Roman"/>
+          <w:sz w:val="32"/>
+          <w:szCs w:val="32"/>
+          <w:lang w:val="vi-VN"/>
+        </w:rPr>
+        <w:t>replace(oldClass, newClass): thay thế 1 class cũ bằng class mới</w:t>
+      </w:r>
+    </w:p>
+    <w:p>
+      <w:pPr>
+        <w:pStyle w:val="ListParagraph"/>
+        <w:ind w:left="1080"/>
+        <w:rPr>
+          <w:rFonts w:ascii="Times New Roman" w:eastAsiaTheme="majorEastAsia" w:hAnsi="Times New Roman" w:cs="Times New Roman"/>
+          <w:sz w:val="32"/>
+          <w:szCs w:val="32"/>
+          <w:lang w:val="vi-VN"/>
+        </w:rPr>
+      </w:pPr>
+    </w:p>
+    <w:p>
+      <w:pPr>
+        <w:pStyle w:val="ListParagraph"/>
+        <w:ind w:left="1080"/>
+        <w:rPr>
+          <w:rFonts w:ascii="Times New Roman" w:eastAsiaTheme="majorEastAsia" w:hAnsi="Times New Roman" w:cs="Times New Roman"/>
+          <w:sz w:val="32"/>
+          <w:szCs w:val="32"/>
+          <w:lang w:val="vi-VN"/>
+        </w:rPr>
+      </w:pPr>
+      <w:r>
+        <w:rPr>
+          <w:rFonts w:ascii="Times New Roman" w:eastAsiaTheme="majorEastAsia" w:hAnsi="Times New Roman" w:cs="Times New Roman"/>
+          <w:sz w:val="32"/>
+          <w:szCs w:val="32"/>
+          <w:lang w:val="vi-VN"/>
+        </w:rPr>
+        <w:t>event.preventDefault(): ngăn chặn hành vi mặc định của trình duyệt</w:t>
+      </w:r>
+    </w:p>
+    <w:p>
+      <w:pPr>
+        <w:pStyle w:val="ListParagraph"/>
+        <w:ind w:left="1080"/>
+        <w:rPr>
+          <w:rFonts w:ascii="Times New Roman" w:eastAsiaTheme="majorEastAsia" w:hAnsi="Times New Roman" w:cs="Times New Roman"/>
+          <w:sz w:val="32"/>
+          <w:szCs w:val="32"/>
+          <w:lang w:val="vi-VN"/>
+        </w:rPr>
+      </w:pPr>
+      <w:r>
+        <w:rPr>
+          <w:rFonts w:ascii="Times New Roman" w:eastAsiaTheme="majorEastAsia" w:hAnsi="Times New Roman" w:cs="Times New Roman"/>
+          <w:sz w:val="32"/>
+          <w:szCs w:val="32"/>
+          <w:lang w:val="vi-VN"/>
+        </w:rPr>
+        <w:t>event.stopPropagation(): ngăn chặn sự kiện nổi bọt (bubbling) ra các phần tử cha</w:t>
+      </w:r>
+    </w:p>
+    <w:p>
+      <w:pPr>
+        <w:pStyle w:val="ListParagraph"/>
+        <w:ind w:left="1080"/>
+        <w:rPr>
+          <w:rFonts w:ascii="Times New Roman" w:eastAsiaTheme="majorEastAsia" w:hAnsi="Times New Roman" w:cs="Times New Roman"/>
+          <w:color w:val="FF0000"/>
+          <w:sz w:val="32"/>
+          <w:szCs w:val="32"/>
+          <w:lang w:val="vi-VN"/>
+        </w:rPr>
+      </w:pPr>
+      <w:r>
+        <w:rPr>
+          <w:rFonts w:ascii="Times New Roman" w:eastAsiaTheme="majorEastAsia" w:hAnsi="Times New Roman" w:cs="Times New Roman"/>
+          <w:color w:val="FF0000"/>
+          <w:sz w:val="32"/>
+          <w:szCs w:val="32"/>
+          <w:lang w:val="vi-VN"/>
+        </w:rPr>
+        <w:t>Cơ chế bọt</w:t>
+      </w:r>
+    </w:p>
+    <w:p>
+      <w:pPr>
+        <w:pStyle w:val="ListParagraph"/>
+        <w:ind w:left="1080"/>
+        <w:rPr>
+          <w:rFonts w:ascii="Times New Roman" w:eastAsiaTheme="majorEastAsia" w:hAnsi="Times New Roman" w:cs="Times New Roman"/>
+          <w:sz w:val="32"/>
+          <w:szCs w:val="32"/>
+          <w:lang w:val="vi-VN"/>
+        </w:rPr>
+      </w:pPr>
+      <w:r>
+        <w:rPr>
+          <w:rFonts w:ascii="Times New Roman" w:eastAsiaTheme="majorEastAsia" w:hAnsi="Times New Roman" w:cs="Times New Roman"/>
+          <w:sz w:val="32"/>
+          <w:szCs w:val="32"/>
+          <w:lang w:val="vi-VN"/>
+        </w:rPr>
+        <w:t>So sánh sự kiện như bong bóng nước nổi từ phần tử con lên cha</w:t>
+      </w:r>
+    </w:p>
+    <w:p>
+      <w:pPr>
+        <w:pStyle w:val="ListParagraph"/>
+        <w:ind w:left="1080"/>
+        <w:rPr>
+          <w:rFonts w:ascii="Times New Roman" w:eastAsiaTheme="majorEastAsia" w:hAnsi="Times New Roman" w:cs="Times New Roman"/>
+          <w:sz w:val="32"/>
+          <w:szCs w:val="32"/>
+          <w:lang w:val="vi-VN"/>
+        </w:rPr>
+      </w:pPr>
+      <w:r>
+        <w:rPr>
+          <w:rFonts w:ascii="Times New Roman" w:eastAsiaTheme="majorEastAsia" w:hAnsi="Times New Roman" w:cs="Times New Roman"/>
+          <w:sz w:val="32"/>
+          <w:szCs w:val="32"/>
+          <w:lang w:val="vi-VN"/>
+        </w:rPr>
+        <w:t>Nếu ko chặn, sự kiện sẽ tiếp tục lan ra toàn bộ cây DOM</w:t>
+      </w:r>
       <w:bookmarkStart w:id="0" w:name="_GoBack"/>
       <w:bookmarkEnd w:id="0"/>
-    </w:p>
-    <w:p>
-      <w:pPr>
-        <w:pStyle w:val="ListParagraph"/>
-        <w:ind w:left="1080"/>
-        <w:rPr>
-          <w:rFonts w:ascii="Times New Roman" w:eastAsiaTheme="majorEastAsia" w:hAnsi="Times New Roman" w:cs="Times New Roman"/>
-          <w:sz w:val="32"/>
-          <w:szCs w:val="32"/>
-          <w:lang w:val="vi-VN"/>
-        </w:rPr>
-      </w:pPr>
-      <w:r>
-        <w:rPr>
-          <w:rFonts w:ascii="Times New Roman" w:eastAsiaTheme="majorEastAsia" w:hAnsi="Times New Roman" w:cs="Times New Roman"/>
-          <w:sz w:val="32"/>
-          <w:szCs w:val="32"/>
-          <w:lang w:val="vi-VN"/>
-        </w:rPr>
-        <w:lastRenderedPageBreak/>
-        <w:t>Phân biệt inline style và external CSS: style chỉ thao tác với inline style, nếu muốn thay đổi toàn bộ nên dùng class và CSS external</w:t>
-      </w:r>
     </w:p>
     <w:sectPr>
       <w:pgSz w:w="12240" w:h="15840"/>

</xml_diff>